<commit_message>
Nomes dos integrantes no relatório e no README
</commit_message>
<xml_diff>
--- a/relatorio/Relatorio_MLP_ENEM.docx
+++ b/relatorio/Relatorio_MLP_ENEM.docx
@@ -76,44 +76,41 @@
     </w:p>
     <w:p>
       <w:pPr>
-        <w:spacing w:after="60"/>
+        <w:spacing w:after="60" w:before="0"/>
         <w:jc w:val="center"/>
       </w:pPr>
       <w:r>
         <w:rPr>
           <w:sz w:val="22"/>
           <w:szCs w:val="22"/>
-          <w:highlight w:val="yellow"/>
         </w:rPr>
-        <w:t xml:space="preserve">[Nome completo – matrícula]</w:t>
+        <w:t xml:space="preserve">João Paulo Monteiro</w:t>
       </w:r>
     </w:p>
     <w:p>
       <w:pPr>
-        <w:spacing w:after="60"/>
+        <w:spacing w:after="60" w:before="0"/>
         <w:jc w:val="center"/>
       </w:pPr>
       <w:r>
         <w:rPr>
           <w:sz w:val="22"/>
           <w:szCs w:val="22"/>
-          <w:highlight w:val="yellow"/>
         </w:rPr>
-        <w:t xml:space="preserve">[Nome completo – matrícula]</w:t>
+        <w:t xml:space="preserve">Pedro Felipe De Moraes Carrijo</w:t>
       </w:r>
     </w:p>
     <w:p>
       <w:pPr>
-        <w:spacing w:after="60"/>
+        <w:spacing w:after="60" w:before="0"/>
         <w:jc w:val="center"/>
       </w:pPr>
       <w:r>
         <w:rPr>
           <w:sz w:val="22"/>
           <w:szCs w:val="22"/>
-          <w:highlight w:val="yellow"/>
         </w:rPr>
-        <w:t xml:space="preserve">[Nome completo – matrícula]</w:t>
+        <w:t xml:space="preserve">Rogérios dos Anjos</w:t>
       </w:r>
     </w:p>
     <w:p>

</xml_diff>